<commit_message>
Apply three content fixes to both inception reports
Fix 1 — UDC categorisation:
- Moved Uganda Development Corporation (UDC) from 'Industry associations'
  to 'Financial Institutions' in both reports
- Renamed category from 'Financiers' to 'Financial Institutions'
- Applied to Report 1 and Report 2 KII tables and both presentations

Fix 2 — Numeric weights:
- Renamed 'Proposed Weight' column to 'Weight' in both reports
- Weights (25/25/20/15/15%) were endorsed in the 29 May dry-run

Fix 3 — Remove attribution:
- Removed 'as stated by Jerome Nuwabaasa' from the analytical principle
  quote in both reports and both presentations

All Word documents and PowerPoint presentations regenerated.

Co-Authored-By: Claude Sonnet 4.6 <noreply@anthropic.com>
</commit_message>
<xml_diff>
--- a/report/inception-report-1.docx
+++ b/report/inception-report-1.docx
@@ -2658,7 +2658,7 @@
               <w:rPr>
                 <w:sz w:val="20"/>
               </w:rPr>
-              <w:t>Uganda Manufacturers Association (UMA), Uganda Development Corporation (UDC)</w:t>
+              <w:t>Uganda Manufacturers Association (UMA)</w:t>
             </w:r>
           </w:p>
         </w:tc>
@@ -2694,7 +2694,7 @@
                 <w:b/>
                 <w:sz w:val="20"/>
               </w:rPr>
-              <w:t>Financiers</w:t>
+              <w:t>Financial Institutions</w:t>
             </w:r>
             <w:r>
               <w:rPr>
@@ -2713,7 +2713,7 @@
               <w:rPr>
                 <w:sz w:val="20"/>
               </w:rPr>
-              <w:t>Uganda Development Bank (UDB), East African Development Bank (EADB), commercial banks</w:t>
+              <w:t>Uganda Development Bank (UDB), Uganda Development Corporation (UDC), East African Development Bank (EADB), commercial banks</w:t>
             </w:r>
           </w:p>
         </w:tc>
@@ -2997,7 +2997,7 @@
                 <w:color w:val="FFFFFF"/>
                 <w:sz w:val="20"/>
               </w:rPr>
-              <w:t>Proposed Weight</w:t>
+              <w:t>Weight</w:t>
             </w:r>
           </w:p>
         </w:tc>
@@ -3588,7 +3588,7 @@
         <w:spacing w:after="80"/>
       </w:pPr>
       <w:r>
-        <w:t>The prioritization framework operationalizes the core analytical principle of this study, as stated by Jerome Nuwabaasa:</w:t>
+        <w:t>The prioritization framework operationalizes the core analytical principle of this study:</w:t>
       </w:r>
     </w:p>
     <w:p/>

</xml_diff>